<commit_message>
Repository in English only: Chinese documents removed, bilingual files and templates in English, Chinese fields dropped from the data; pages link to the English documents
Co-Authored-By: Claude Opus 5.5 <noreply@anthropic.com>
Claude-Session: https://claude.ai/code/session_01Vd3we9LcnMYHx2zRBjHPb4
</commit_message>
<xml_diff>
--- a/templates/firm-application-form.docx
+++ b/templates/firm-application-form.docx
@@ -17,7 +17,7 @@
           <w:b/>
           <w:sz w:val="24"/>
         </w:rPr>
-        <w:t>Application form · 申请表 · Formulario de postulación</w:t>
+        <w:t>Application form · Formulario de postulación</w:t>
       </w:r>
     </w:p>
     <w:p>
@@ -26,7 +26,7 @@
           <w:i/>
           <w:sz w:val="17"/>
         </w:rPr>
-        <w:t>One page, signed by the lead, placed as the first page of the application PDF (call for qualifications, section 3). 一页，由牵头方签署，放在申请 PDF 的第一页（见资质征集文件第 3 节）。 Una página, firmada por el líder, como primera página del PDF de postulación (convocatoria, sección 3).</w:t>
+        <w:t>One page, signed by the lead, placed as the first page of the application PDF (call for qualifications, section 3). Una página, firmada por el líder, como primera página del PDF de postulación (convocatoria, sección 3).</w:t>
       </w:r>
     </w:p>
     <w:p>
@@ -35,7 +35,7 @@
           <w:b/>
           <w:sz w:val="22"/>
         </w:rPr>
-        <w:t>1  Lead practice · 牵头机构 · Estudio líder</w:t>
+        <w:t>1  Lead practice · Estudio líder</w:t>
       </w:r>
     </w:p>
     <w:tbl>
@@ -55,7 +55,7 @@
           </w:tcPr>
           <w:p>
             <w:r>
-              <w:t>Practice name · 机构名称 · Nombre del estudio</w:t>
+              <w:t>Practice name · Nombre del estudio</w:t>
             </w:r>
           </w:p>
         </w:tc>
@@ -73,7 +73,7 @@
           </w:tcPr>
           <w:p>
             <w:r>
-              <w:t>Country, city · 国家与城市 · País y ciudad</w:t>
+              <w:t>Country, city · País y ciudad</w:t>
             </w:r>
           </w:p>
         </w:tc>
@@ -91,7 +91,7 @@
           </w:tcPr>
           <w:p>
             <w:r>
-              <w:t>Registration no. / legal form · 注册号 / 机构性质 · Matrícula / forma jurídica</w:t>
+              <w:t>Registration no. / legal form · Matrícula / forma jurídica</w:t>
             </w:r>
           </w:p>
         </w:tc>
@@ -109,7 +109,7 @@
           </w:tcPr>
           <w:p>
             <w:r>
-              <w:t>Contact person, role · 联系人与职务 · Persona de contacto y cargo</w:t>
+              <w:t>Contact person, role · Persona de contacto y cargo</w:t>
             </w:r>
           </w:p>
         </w:tc>
@@ -127,7 +127,7 @@
           </w:tcPr>
           <w:p>
             <w:r>
-              <w:t>Email · 邮箱 · Correo</w:t>
+              <w:t>Email · Correo</w:t>
             </w:r>
           </w:p>
         </w:tc>
@@ -145,7 +145,7 @@
           </w:tcPr>
           <w:p>
             <w:r>
-              <w:t>Phone · 电话 · Teléfono</w:t>
+              <w:t>Phone · Teléfono</w:t>
             </w:r>
           </w:p>
         </w:tc>
@@ -163,7 +163,7 @@
           <w:b/>
           <w:sz w:val="22"/>
         </w:rPr>
-        <w:t>2  Team · 团队 · Equipo</w:t>
+        <w:t>2  Team · Equipo</w:t>
       </w:r>
     </w:p>
     <w:p>
@@ -172,7 +172,7 @@
           <w:i/>
           <w:sz w:val="17"/>
         </w:rPr>
-        <w:t>Lead first. Cover urban design, landscape and ecology, energy and infrastructure, and water; partners may be completed by stage 2. 先填牵头方。需覆盖城市设计、景观与生态、能源与基础设施、水；合作方可在第二阶段补齐。 Primero el líder. Deben cubrirse diseño urbano, paisaje y ecología, energía e infraestructura, y agua; los socios pueden completarse en la etapa 2.</w:t>
+        <w:t>Lead first. Cover urban design, landscape and ecology, energy and infrastructure, and water; partners may be completed by stage 2. Primero el líder. Deben cubrirse diseño urbano, paisaje y ecología, energía e infraestructura, y agua; los socios pueden completarse en la etapa 2.</w:t>
       </w:r>
     </w:p>
     <w:tbl>
@@ -198,7 +198,7 @@
                 <w:b/>
                 <w:sz w:val="17"/>
               </w:rPr>
-              <w:t>Firm · 机构 · Estudio</w:t>
+              <w:t>Firm · Estudio</w:t>
             </w:r>
           </w:p>
         </w:tc>
@@ -212,7 +212,7 @@
                 <w:b/>
                 <w:sz w:val="17"/>
               </w:rPr>
-              <w:t>Country · 国家 · País</w:t>
+              <w:t>Country · País</w:t>
             </w:r>
           </w:p>
         </w:tc>
@@ -226,7 +226,7 @@
                 <w:b/>
                 <w:sz w:val="17"/>
               </w:rPr>
-              <w:t>Discipline · 专业 · Disciplina</w:t>
+              <w:t>Discipline · Disciplina</w:t>
             </w:r>
           </w:p>
         </w:tc>
@@ -240,7 +240,7 @@
                 <w:b/>
                 <w:sz w:val="17"/>
               </w:rPr>
-              <w:t>Role · 分工 · Rol</w:t>
+              <w:t>Role · Rol</w:t>
             </w:r>
           </w:p>
         </w:tc>
@@ -382,7 +382,7 @@
           <w:b/>
           <w:sz w:val="22"/>
         </w:rPr>
-        <w:t>3  Reference projects · 代表项目 · Proyectos de referencia</w:t>
+        <w:t>3  Reference projects · Proyectos de referencia</w:t>
       </w:r>
     </w:p>
     <w:p>
@@ -391,7 +391,7 @@
           <w:i/>
           <w:sz w:val="17"/>
         </w:rPr>
-        <w:t>Three to five; at least one masterplan or new district of 100 ha or more led or completed in the last fifteen years. 3–5 个；至少一项为近十五年内完成或主导的、100 公顷以上的总体规划或新区。 De tres a cinco; al menos un plan maestro o nuevo distrito de 100 ha o más, liderado o terminado en los últimos quince años.</w:t>
+        <w:t>Three to five; at least one masterplan or new district of 100 ha or more led or completed in the last fifteen years. De tres a cinco; al menos un plan maestro o nuevo distrito de 100 ha o más, liderado o terminado en los últimos quince años.</w:t>
       </w:r>
     </w:p>
     <w:tbl>
@@ -419,7 +419,7 @@
                 <w:b/>
                 <w:sz w:val="17"/>
               </w:rPr>
-              <w:t>Project · 项目 · Proyecto</w:t>
+              <w:t>Project · Proyecto</w:t>
             </w:r>
           </w:p>
         </w:tc>
@@ -433,7 +433,7 @@
                 <w:b/>
                 <w:sz w:val="17"/>
               </w:rPr>
-              <w:t>Location · 地点 · Lugar</w:t>
+              <w:t>Location · Lugar</w:t>
             </w:r>
           </w:p>
         </w:tc>
@@ -447,7 +447,7 @@
                 <w:b/>
                 <w:sz w:val="17"/>
               </w:rPr>
-              <w:t>Scale (ha) · 规模 · Escala</w:t>
+              <w:t>Scale (ha) · Escala</w:t>
             </w:r>
           </w:p>
         </w:tc>
@@ -461,7 +461,7 @@
                 <w:b/>
                 <w:sz w:val="17"/>
               </w:rPr>
-              <w:t>Your role · 角色 · Rol</w:t>
+              <w:t>Your role · Rol</w:t>
             </w:r>
           </w:p>
         </w:tc>
@@ -475,7 +475,7 @@
                 <w:b/>
                 <w:sz w:val="17"/>
               </w:rPr>
-              <w:t>Status, year · 状态与年份 · Estado, año</w:t>
+              <w:t>Status, year · Estado, año</w:t>
             </w:r>
           </w:p>
         </w:tc>
@@ -489,7 +489,7 @@
                 <w:b/>
                 <w:sz w:val="17"/>
               </w:rPr>
-              <w:t>Client · 业主 · Cliente</w:t>
+              <w:t>Client · Cliente</w:t>
             </w:r>
           </w:p>
         </w:tc>
@@ -691,32 +691,32 @@
           <w:b/>
           <w:sz w:val="22"/>
         </w:rPr>
-        <w:t>4  Declarations · 声明 · Declaraciones</w:t>
+        <w:t>4  Declarations · Declaraciones</w:t>
       </w:r>
     </w:p>
     <w:p>
       <w:r>
-        <w:t>☐ The lead is a legally constituted practice in urban design, planning, landscape architecture or architecture. · 牵头方为依法设立的城市设计、规划、景观或建筑事务所。 · El líder es un estudio legalmente constituido de diseño urbano, planificación, paisaje o arquitectura.</w:t>
+        <w:t>☐ The lead is a legally constituted practice in urban design, planning, landscape architecture or architecture. · El líder es un estudio legalmente constituido de diseño urbano, planificación, paisaje o arquitectura.</w:t>
       </w:r>
     </w:p>
     <w:p>
       <w:r>
-        <w:t>☐ No firm in this team leads or joins another team. · 团队中的每家机构都没有参加其他团队。 · Ningún estudio de este equipo lidera ni integra otro equipo.</w:t>
+        <w:t>☐ No firm in this team leads or joins another team. · Ningún estudio de este equipo lidera ni integra otro equipo.</w:t>
       </w:r>
     </w:p>
     <w:p>
       <w:r>
-        <w:t>☐ No member has a conflict of interest with the organiser or the jury (signed declaration attached). · 团队成员与主办方、评审团不存在利益冲突（已附签署的声明）。 · Ningún integrante tiene conflicto de intereses con el organizador o el jurado (declaración firmada adjunta).</w:t>
+        <w:t>☐ No member has a conflict of interest with the organiser or the jury (signed declaration attached). · Ningún integrante tiene conflicto de intereses con el organizador o el jurado (declaración firmada adjunta).</w:t>
       </w:r>
     </w:p>
     <w:p>
       <w:r>
-        <w:t>☐ AI tools we use, if any, are disclosed in the approach statement. · 如使用 AI 工具，已在思路说明中披露。 · Las herramientas de IA que usemos, si las hay, se declaran en la declaración de enfoque.</w:t>
+        <w:t>☐ AI tools we use, if any, are disclosed in the approach statement. · Las herramientas de IA que usemos, si las hay, se declaran en la declaración de enfoque.</w:t>
       </w:r>
     </w:p>
     <w:p>
       <w:r>
-        <w:t>☐ We accept that dates, the jury, the honorarium and the terms that follow are published with the formal rules, which then govern. · 我们知悉：日期、评审团、设计补偿及后续条款随正式规则公布，并以正式规则为准。 · Aceptamos que las fechas, el jurado, el honorario y las condiciones posteriores se publican con las bases oficiales, que entonces rigen.</w:t>
+        <w:t>☐ We accept that dates, the jury, the honorarium and the terms that follow are published with the formal rules, which then govern. · Aceptamos que las fechas, el jurado, el honorario y las condiciones posteriores se publican con las bases oficiales, que entonces rigen.</w:t>
       </w:r>
     </w:p>
     <w:p>
@@ -725,7 +725,7 @@
           <w:b/>
           <w:sz w:val="22"/>
         </w:rPr>
-        <w:t>5  Signature · 签署 · Firma</w:t>
+        <w:t>5  Signature · Firma</w:t>
       </w:r>
     </w:p>
     <w:tbl>
@@ -745,7 +745,7 @@
           </w:tcPr>
           <w:p>
             <w:r>
-              <w:t>Name and role of signatory · 签署人姓名与职务 · Nombre y cargo</w:t>
+              <w:t>Name and role of signatory · Nombre y cargo</w:t>
             </w:r>
           </w:p>
         </w:tc>
@@ -763,7 +763,7 @@
           </w:tcPr>
           <w:p>
             <w:r>
-              <w:t>Signature · 签字 · Firma</w:t>
+              <w:t>Signature · Firma</w:t>
             </w:r>
           </w:p>
         </w:tc>
@@ -781,7 +781,7 @@
           </w:tcPr>
           <w:p>
             <w:r>
-              <w:t>Date · 日期 · Fecha</w:t>
+              <w:t>Date · Fecha</w:t>
             </w:r>
           </w:p>
         </w:tc>
@@ -798,7 +798,7 @@
         <w:rPr>
           <w:sz w:val="17"/>
         </w:rPr>
-        <w:t>Send with the application PDF to competition@xcity.ai · 与申请 PDF 一并发至 competition@xcity.ai · Envíe con el PDF a competition@xcity.ai</w:t>
+        <w:t>Send with the application PDF to competition@xcity.ai · Envíe con el PDF a competition@xcity.ai</w:t>
       </w:r>
     </w:p>
     <w:sectPr>

</xml_diff>

<commit_message>
Design Practice Call: one application by email (two PDFs, initial ideas up to 10 pages); US$50,000 honorarium and prize; new form and stage-one site data
Co-Authored-By: Claude Opus 5.5 <noreply@anthropic.com>
Claude-Session: https://claude.ai/code/session_01Vd3we9LcnMYHx2zRBjHPb4
</commit_message>
<xml_diff>
--- a/templates/firm-application-form.docx
+++ b/templates/firm-application-form.docx
@@ -3,39 +3,59 @@
 <w:document xmlns:wpc="http://schemas.microsoft.com/office/word/2010/wordprocessingCanvas" xmlns:mo="http://schemas.microsoft.com/office/mac/office/2008/main" xmlns:mc="http://schemas.openxmlformats.org/markup-compatibility/2006" xmlns:mv="urn:schemas-microsoft-com:mac:vml" xmlns:o="urn:schemas-microsoft-com:office:office" xmlns:r="http://schemas.openxmlformats.org/officeDocument/2006/relationships" xmlns:m="http://schemas.openxmlformats.org/officeDocument/2006/math" xmlns:v="urn:schemas-microsoft-com:vml" xmlns:wp14="http://schemas.microsoft.com/office/word/2010/wordprocessingDrawing" xmlns:wp="http://schemas.openxmlformats.org/drawingml/2006/wordprocessingDrawing" xmlns:w10="urn:schemas-microsoft-com:office:word" xmlns:w="http://schemas.openxmlformats.org/wordprocessingml/2006/main" xmlns:w14="http://schemas.microsoft.com/office/word/2010/wordml" xmlns:wpg="http://schemas.microsoft.com/office/word/2010/wordprocessingGroup" xmlns:wpi="http://schemas.microsoft.com/office/word/2010/wordprocessingInk" xmlns:wne="http://schemas.microsoft.com/office/word/2006/wordml" xmlns:wps="http://schemas.microsoft.com/office/word/2010/wordprocessingShape" mc:Ignorable="w14 wp14">
   <w:body>
     <w:p>
+      <w:pPr>
+        <w:spacing w:after="40" w:before="0"/>
+      </w:pPr>
       <w:r>
         <w:rPr>
           <w:b/>
-          <w:sz w:val="30"/>
+          <w:i w:val="0"/>
+          <w:color w:val="9A773A"/>
+          <w:sz w:val="16"/>
         </w:rPr>
-        <w:t>XCITY AI Competition · Design practice track</w:t>
+        <w:t>XCITY · URBAN DESIGN AND AI PLANNING CALLS</w:t>
       </w:r>
     </w:p>
     <w:p>
+      <w:pPr>
+        <w:spacing w:after="40" w:before="0"/>
+      </w:pPr>
       <w:r>
         <w:rPr>
           <w:b/>
-          <w:sz w:val="24"/>
+          <w:i w:val="0"/>
+          <w:color w:val="1F1F1F"/>
+          <w:sz w:val="32"/>
         </w:rPr>
-        <w:t>Application form · Formulario de postulación</w:t>
+        <w:t>Design Practice Call — Application form</w:t>
       </w:r>
     </w:p>
     <w:p>
+      <w:pPr>
+        <w:spacing w:after="120" w:before="0"/>
+      </w:pPr>
       <w:r>
         <w:rPr>
-          <w:i/>
+          <w:b w:val="0"/>
+          <w:i w:val="0"/>
+          <w:color w:val="6B6860"/>
           <w:sz w:val="17"/>
         </w:rPr>
-        <w:t>One page, signed by the lead, placed as the first page of the application PDF (call for qualifications, section 3). Una página, firmada por el líder, como primera página del PDF de postulación (convocatoria, sección 3).</w:t>
+        <w:t>Stage one. Fill in, sign, and place as the first pages of PDF ① (the application). Send PDF ① and PDF ② (initial ideas, up to 10 pages) in one email to competition@xcity.ai, subject “XCITY - Design Practice Call - Application - practice name”. English or Chinese.</w:t>
       </w:r>
     </w:p>
     <w:p>
+      <w:pPr>
+        <w:spacing w:after="60" w:before="180"/>
+      </w:pPr>
       <w:r>
         <w:rPr>
           <w:b/>
+          <w:i w:val="0"/>
+          <w:color w:val="9A773A"/>
           <w:sz w:val="22"/>
         </w:rPr>
-        <w:t>1  Lead practice · Estudio líder</w:t>
+        <w:t>1  Applicant</w:t>
       </w:r>
     </w:p>
     <w:tbl>
@@ -45,134 +65,316 @@
         <w:tblLook w:firstColumn="1" w:firstRow="1" w:lastColumn="0" w:lastRow="0" w:noHBand="0" w:noVBand="1" w:val="04A0"/>
       </w:tblPr>
       <w:tblGrid>
-        <w:gridCol w:w="5100"/>
-        <w:gridCol w:w="5100"/>
+        <w:gridCol w:w="4933"/>
+        <w:gridCol w:w="4933"/>
       </w:tblGrid>
       <w:tr>
+        <w:trPr>
+          <w:trHeight w:val="351"/>
+        </w:trPr>
         <w:tc>
           <w:tcPr>
-            <w:tcW w:type="dxa" w:w="5100"/>
+            <w:tcW w:type="dxa" w:w="3515"/>
           </w:tcPr>
           <w:p>
             <w:r>
-              <w:t>Practice name · Nombre del estudio</w:t>
+              <w:rPr>
+                <w:color w:val="6B6860"/>
+                <w:sz w:val="17"/>
+              </w:rPr>
+              <w:t>Practice name</w:t>
             </w:r>
           </w:p>
         </w:tc>
         <w:tc>
           <w:tcPr>
-            <w:tcW w:type="dxa" w:w="5100"/>
+            <w:tcW w:type="dxa" w:w="6350"/>
           </w:tcPr>
-          <w:p/>
+          <w:p>
+            <w:r>
+              <w:rPr>
+                <w:sz w:val="17"/>
+              </w:rPr>
+            </w:r>
+          </w:p>
         </w:tc>
       </w:tr>
       <w:tr>
+        <w:trPr>
+          <w:trHeight w:val="351"/>
+        </w:trPr>
         <w:tc>
           <w:tcPr>
-            <w:tcW w:type="dxa" w:w="5100"/>
+            <w:tcW w:type="dxa" w:w="3515"/>
           </w:tcPr>
           <w:p>
             <w:r>
-              <w:t>Country, city · País y ciudad</w:t>
+              <w:rPr>
+                <w:color w:val="6B6860"/>
+                <w:sz w:val="17"/>
+              </w:rPr>
+              <w:t>Country and city</w:t>
             </w:r>
           </w:p>
         </w:tc>
         <w:tc>
           <w:tcPr>
-            <w:tcW w:type="dxa" w:w="5100"/>
+            <w:tcW w:type="dxa" w:w="6350"/>
           </w:tcPr>
-          <w:p/>
+          <w:p>
+            <w:r>
+              <w:rPr>
+                <w:sz w:val="17"/>
+              </w:rPr>
+            </w:r>
+          </w:p>
         </w:tc>
       </w:tr>
       <w:tr>
+        <w:trPr>
+          <w:trHeight w:val="351"/>
+        </w:trPr>
         <w:tc>
           <w:tcPr>
-            <w:tcW w:type="dxa" w:w="5100"/>
+            <w:tcW w:type="dxa" w:w="3515"/>
           </w:tcPr>
           <w:p>
             <w:r>
-              <w:t>Registration no. / legal form · Matrícula / forma jurídica</w:t>
+              <w:rPr>
+                <w:color w:val="6B6860"/>
+                <w:sz w:val="17"/>
+              </w:rPr>
+              <w:t>Registration number and legal form</w:t>
             </w:r>
           </w:p>
         </w:tc>
         <w:tc>
           <w:tcPr>
-            <w:tcW w:type="dxa" w:w="5100"/>
+            <w:tcW w:type="dxa" w:w="6350"/>
           </w:tcPr>
-          <w:p/>
+          <w:p>
+            <w:r>
+              <w:rPr>
+                <w:sz w:val="17"/>
+              </w:rPr>
+            </w:r>
+          </w:p>
         </w:tc>
       </w:tr>
       <w:tr>
+        <w:trPr>
+          <w:trHeight w:val="351"/>
+        </w:trPr>
         <w:tc>
           <w:tcPr>
-            <w:tcW w:type="dxa" w:w="5100"/>
+            <w:tcW w:type="dxa" w:w="3515"/>
           </w:tcPr>
           <w:p>
             <w:r>
-              <w:t>Contact person, role · Persona de contacto y cargo</w:t>
+              <w:rPr>
+                <w:color w:val="6B6860"/>
+                <w:sz w:val="17"/>
+              </w:rPr>
+              <w:t>Website</w:t>
             </w:r>
           </w:p>
         </w:tc>
         <w:tc>
           <w:tcPr>
-            <w:tcW w:type="dxa" w:w="5100"/>
+            <w:tcW w:type="dxa" w:w="6350"/>
           </w:tcPr>
-          <w:p/>
+          <w:p>
+            <w:r>
+              <w:rPr>
+                <w:sz w:val="17"/>
+              </w:rPr>
+            </w:r>
+          </w:p>
         </w:tc>
       </w:tr>
       <w:tr>
+        <w:trPr>
+          <w:trHeight w:val="351"/>
+        </w:trPr>
         <w:tc>
           <w:tcPr>
-            <w:tcW w:type="dxa" w:w="5100"/>
+            <w:tcW w:type="dxa" w:w="3515"/>
           </w:tcPr>
           <w:p>
             <w:r>
-              <w:t>Email · Correo</w:t>
+              <w:rPr>
+                <w:color w:val="6B6860"/>
+                <w:sz w:val="17"/>
+              </w:rPr>
+              <w:t>Applying as</w:t>
             </w:r>
           </w:p>
         </w:tc>
         <w:tc>
           <w:tcPr>
-            <w:tcW w:type="dxa" w:w="5100"/>
+            <w:tcW w:type="dxa" w:w="6350"/>
           </w:tcPr>
-          <w:p/>
+          <w:p>
+            <w:r>
+              <w:rPr>
+                <w:sz w:val="17"/>
+              </w:rPr>
+              <w:t>☐ a single practice     ☐ a consortium (complete section 4)</w:t>
+            </w:r>
+          </w:p>
         </w:tc>
       </w:tr>
       <w:tr>
+        <w:trPr>
+          <w:trHeight w:val="351"/>
+        </w:trPr>
         <w:tc>
           <w:tcPr>
-            <w:tcW w:type="dxa" w:w="5100"/>
+            <w:tcW w:type="dxa" w:w="3515"/>
           </w:tcPr>
           <w:p>
             <w:r>
-              <w:t>Phone · Teléfono</w:t>
+              <w:rPr>
+                <w:color w:val="6B6860"/>
+                <w:sz w:val="17"/>
+              </w:rPr>
+              <w:t>Authorised representative (name, role)</w:t>
             </w:r>
           </w:p>
         </w:tc>
         <w:tc>
           <w:tcPr>
-            <w:tcW w:type="dxa" w:w="5100"/>
+            <w:tcW w:type="dxa" w:w="6350"/>
           </w:tcPr>
-          <w:p/>
+          <w:p>
+            <w:r>
+              <w:rPr>
+                <w:sz w:val="17"/>
+              </w:rPr>
+            </w:r>
+          </w:p>
+        </w:tc>
+      </w:tr>
+      <w:tr>
+        <w:trPr>
+          <w:trHeight w:val="351"/>
+        </w:trPr>
+        <w:tc>
+          <w:tcPr>
+            <w:tcW w:type="dxa" w:w="3515"/>
+          </w:tcPr>
+          <w:p>
+            <w:r>
+              <w:rPr>
+                <w:color w:val="6B6860"/>
+                <w:sz w:val="17"/>
+              </w:rPr>
+              <w:t>Contact person (name, role)</w:t>
+            </w:r>
+          </w:p>
+        </w:tc>
+        <w:tc>
+          <w:tcPr>
+            <w:tcW w:type="dxa" w:w="6350"/>
+          </w:tcPr>
+          <w:p>
+            <w:r>
+              <w:rPr>
+                <w:sz w:val="17"/>
+              </w:rPr>
+            </w:r>
+          </w:p>
+        </w:tc>
+      </w:tr>
+      <w:tr>
+        <w:trPr>
+          <w:trHeight w:val="351"/>
+        </w:trPr>
+        <w:tc>
+          <w:tcPr>
+            <w:tcW w:type="dxa" w:w="3515"/>
+          </w:tcPr>
+          <w:p>
+            <w:r>
+              <w:rPr>
+                <w:color w:val="6B6860"/>
+                <w:sz w:val="17"/>
+              </w:rPr>
+              <w:t>Email</w:t>
+            </w:r>
+          </w:p>
+        </w:tc>
+        <w:tc>
+          <w:tcPr>
+            <w:tcW w:type="dxa" w:w="6350"/>
+          </w:tcPr>
+          <w:p>
+            <w:r>
+              <w:rPr>
+                <w:sz w:val="17"/>
+              </w:rPr>
+            </w:r>
+          </w:p>
+        </w:tc>
+      </w:tr>
+      <w:tr>
+        <w:trPr>
+          <w:trHeight w:val="351"/>
+        </w:trPr>
+        <w:tc>
+          <w:tcPr>
+            <w:tcW w:type="dxa" w:w="3515"/>
+          </w:tcPr>
+          <w:p>
+            <w:r>
+              <w:rPr>
+                <w:color w:val="6B6860"/>
+                <w:sz w:val="17"/>
+              </w:rPr>
+              <w:t>Phone</w:t>
+            </w:r>
+          </w:p>
+        </w:tc>
+        <w:tc>
+          <w:tcPr>
+            <w:tcW w:type="dxa" w:w="6350"/>
+          </w:tcPr>
+          <w:p>
+            <w:r>
+              <w:rPr>
+                <w:sz w:val="17"/>
+              </w:rPr>
+            </w:r>
+          </w:p>
         </w:tc>
       </w:tr>
     </w:tbl>
     <w:p>
+      <w:pPr>
+        <w:spacing w:after="60" w:before="180"/>
+      </w:pPr>
       <w:r>
         <w:rPr>
           <w:b/>
+          <w:i w:val="0"/>
+          <w:color w:val="9A773A"/>
           <w:sz w:val="22"/>
         </w:rPr>
-        <w:t>2  Team · Equipo</w:t>
+        <w:t>2  The actual team</w:t>
       </w:r>
     </w:p>
     <w:p>
+      <w:pPr>
+        <w:spacing w:after="80" w:before="0"/>
+      </w:pPr>
       <w:r>
         <w:rPr>
-          <w:i/>
+          <w:b w:val="0"/>
+          <w:i w:val="0"/>
+          <w:color w:val="6B6860"/>
           <w:sz w:val="17"/>
         </w:rPr>
-        <w:t>Lead first. Cover urban design, landscape and ecology, energy and infrastructure, and water; partners may be completed by stage 2. Primero el líder. Deben cubrirse diseño urbano, paisaje y ecología, energía e infraestructura, y agua; los socios pueden completarse en la etapa 2.</w:t>
+        <w:t>Lead designer first. Name the people who will really do the work, and their discipline: masterplanning, urban design, landscape and ecology, and how water, energy, transport and delivery are covered.</w:t>
       </w:r>
     </w:p>
     <w:tbl>
@@ -182,15 +384,16 @@
         <w:tblLook w:firstColumn="1" w:firstRow="1" w:lastColumn="0" w:lastRow="0" w:noHBand="0" w:noVBand="1" w:val="04A0"/>
       </w:tblPr>
       <w:tblGrid>
-        <w:gridCol w:w="2550"/>
-        <w:gridCol w:w="2550"/>
-        <w:gridCol w:w="2550"/>
-        <w:gridCol w:w="2550"/>
+        <w:gridCol w:w="2466"/>
+        <w:gridCol w:w="2466"/>
+        <w:gridCol w:w="2466"/>
+        <w:gridCol w:w="2466"/>
       </w:tblGrid>
       <w:tr>
         <w:tc>
           <w:tcPr>
-            <w:tcW w:type="dxa" w:w="2550"/>
+            <w:tcW w:type="dxa" w:w="2438"/>
+            <w:shd w:val="clear" w:color="auto" w:fill="EFEBE3"/>
           </w:tcPr>
           <w:p>
             <w:r>
@@ -198,13 +401,14 @@
                 <w:b/>
                 <w:sz w:val="17"/>
               </w:rPr>
-              <w:t>Firm · Estudio</w:t>
+              <w:t>Name</w:t>
             </w:r>
           </w:p>
         </w:tc>
         <w:tc>
           <w:tcPr>
-            <w:tcW w:type="dxa" w:w="2550"/>
+            <w:tcW w:type="dxa" w:w="2438"/>
+            <w:shd w:val="clear" w:color="auto" w:fill="EFEBE3"/>
           </w:tcPr>
           <w:p>
             <w:r>
@@ -212,13 +416,14 @@
                 <w:b/>
                 <w:sz w:val="17"/>
               </w:rPr>
-              <w:t>Country · País</w:t>
+              <w:t>Firm</w:t>
             </w:r>
           </w:p>
         </w:tc>
         <w:tc>
           <w:tcPr>
-            <w:tcW w:type="dxa" w:w="2550"/>
+            <w:tcW w:type="dxa" w:w="2154"/>
+            <w:shd w:val="clear" w:color="auto" w:fill="EFEBE3"/>
           </w:tcPr>
           <w:p>
             <w:r>
@@ -226,13 +431,14 @@
                 <w:b/>
                 <w:sz w:val="17"/>
               </w:rPr>
-              <w:t>Discipline · Disciplina</w:t>
+              <w:t>Discipline</w:t>
             </w:r>
           </w:p>
         </w:tc>
         <w:tc>
           <w:tcPr>
-            <w:tcW w:type="dxa" w:w="2550"/>
+            <w:tcW w:type="dxa" w:w="2835"/>
+            <w:shd w:val="clear" w:color="auto" w:fill="EFEBE3"/>
           </w:tcPr>
           <w:p>
             <w:r>
@@ -240,158 +446,409 @@
                 <w:b/>
                 <w:sz w:val="17"/>
               </w:rPr>
-              <w:t>Role · Rol</w:t>
+              <w:t>Role in this project</w:t>
             </w:r>
           </w:p>
         </w:tc>
       </w:tr>
       <w:tr>
+        <w:trPr>
+          <w:trHeight w:val="351"/>
+        </w:trPr>
         <w:tc>
           <w:tcPr>
-            <w:tcW w:type="dxa" w:w="2550"/>
+            <w:tcW w:type="dxa" w:w="2438"/>
           </w:tcPr>
-          <w:p/>
+          <w:p>
+            <w:r>
+              <w:rPr>
+                <w:sz w:val="17"/>
+              </w:rPr>
+            </w:r>
+          </w:p>
         </w:tc>
         <w:tc>
           <w:tcPr>
-            <w:tcW w:type="dxa" w:w="2550"/>
+            <w:tcW w:type="dxa" w:w="2438"/>
           </w:tcPr>
-          <w:p/>
+          <w:p>
+            <w:r>
+              <w:rPr>
+                <w:sz w:val="17"/>
+              </w:rPr>
+            </w:r>
+          </w:p>
         </w:tc>
         <w:tc>
           <w:tcPr>
-            <w:tcW w:type="dxa" w:w="2550"/>
+            <w:tcW w:type="dxa" w:w="2154"/>
           </w:tcPr>
-          <w:p/>
+          <w:p>
+            <w:r>
+              <w:rPr>
+                <w:sz w:val="17"/>
+              </w:rPr>
+            </w:r>
+          </w:p>
         </w:tc>
         <w:tc>
           <w:tcPr>
-            <w:tcW w:type="dxa" w:w="2550"/>
+            <w:tcW w:type="dxa" w:w="2835"/>
           </w:tcPr>
-          <w:p/>
+          <w:p>
+            <w:r>
+              <w:rPr>
+                <w:sz w:val="17"/>
+              </w:rPr>
+            </w:r>
+          </w:p>
         </w:tc>
       </w:tr>
       <w:tr>
+        <w:trPr>
+          <w:trHeight w:val="351"/>
+        </w:trPr>
         <w:tc>
           <w:tcPr>
-            <w:tcW w:type="dxa" w:w="2550"/>
+            <w:tcW w:type="dxa" w:w="2438"/>
           </w:tcPr>
-          <w:p/>
+          <w:p>
+            <w:r>
+              <w:rPr>
+                <w:sz w:val="17"/>
+              </w:rPr>
+            </w:r>
+          </w:p>
         </w:tc>
         <w:tc>
           <w:tcPr>
-            <w:tcW w:type="dxa" w:w="2550"/>
+            <w:tcW w:type="dxa" w:w="2438"/>
           </w:tcPr>
-          <w:p/>
+          <w:p>
+            <w:r>
+              <w:rPr>
+                <w:sz w:val="17"/>
+              </w:rPr>
+            </w:r>
+          </w:p>
         </w:tc>
         <w:tc>
           <w:tcPr>
-            <w:tcW w:type="dxa" w:w="2550"/>
+            <w:tcW w:type="dxa" w:w="2154"/>
           </w:tcPr>
-          <w:p/>
+          <w:p>
+            <w:r>
+              <w:rPr>
+                <w:sz w:val="17"/>
+              </w:rPr>
+            </w:r>
+          </w:p>
         </w:tc>
         <w:tc>
           <w:tcPr>
-            <w:tcW w:type="dxa" w:w="2550"/>
+            <w:tcW w:type="dxa" w:w="2835"/>
           </w:tcPr>
-          <w:p/>
+          <w:p>
+            <w:r>
+              <w:rPr>
+                <w:sz w:val="17"/>
+              </w:rPr>
+            </w:r>
+          </w:p>
         </w:tc>
       </w:tr>
       <w:tr>
+        <w:trPr>
+          <w:trHeight w:val="351"/>
+        </w:trPr>
         <w:tc>
           <w:tcPr>
-            <w:tcW w:type="dxa" w:w="2550"/>
+            <w:tcW w:type="dxa" w:w="2438"/>
           </w:tcPr>
-          <w:p/>
+          <w:p>
+            <w:r>
+              <w:rPr>
+                <w:sz w:val="17"/>
+              </w:rPr>
+            </w:r>
+          </w:p>
         </w:tc>
         <w:tc>
           <w:tcPr>
-            <w:tcW w:type="dxa" w:w="2550"/>
+            <w:tcW w:type="dxa" w:w="2438"/>
           </w:tcPr>
-          <w:p/>
+          <w:p>
+            <w:r>
+              <w:rPr>
+                <w:sz w:val="17"/>
+              </w:rPr>
+            </w:r>
+          </w:p>
         </w:tc>
         <w:tc>
           <w:tcPr>
-            <w:tcW w:type="dxa" w:w="2550"/>
+            <w:tcW w:type="dxa" w:w="2154"/>
           </w:tcPr>
-          <w:p/>
+          <w:p>
+            <w:r>
+              <w:rPr>
+                <w:sz w:val="17"/>
+              </w:rPr>
+            </w:r>
+          </w:p>
         </w:tc>
         <w:tc>
           <w:tcPr>
-            <w:tcW w:type="dxa" w:w="2550"/>
+            <w:tcW w:type="dxa" w:w="2835"/>
           </w:tcPr>
-          <w:p/>
+          <w:p>
+            <w:r>
+              <w:rPr>
+                <w:sz w:val="17"/>
+              </w:rPr>
+            </w:r>
+          </w:p>
         </w:tc>
       </w:tr>
       <w:tr>
+        <w:trPr>
+          <w:trHeight w:val="351"/>
+        </w:trPr>
         <w:tc>
           <w:tcPr>
-            <w:tcW w:type="dxa" w:w="2550"/>
+            <w:tcW w:type="dxa" w:w="2438"/>
           </w:tcPr>
-          <w:p/>
+          <w:p>
+            <w:r>
+              <w:rPr>
+                <w:sz w:val="17"/>
+              </w:rPr>
+            </w:r>
+          </w:p>
         </w:tc>
         <w:tc>
           <w:tcPr>
-            <w:tcW w:type="dxa" w:w="2550"/>
+            <w:tcW w:type="dxa" w:w="2438"/>
           </w:tcPr>
-          <w:p/>
+          <w:p>
+            <w:r>
+              <w:rPr>
+                <w:sz w:val="17"/>
+              </w:rPr>
+            </w:r>
+          </w:p>
         </w:tc>
         <w:tc>
           <w:tcPr>
-            <w:tcW w:type="dxa" w:w="2550"/>
+            <w:tcW w:type="dxa" w:w="2154"/>
           </w:tcPr>
-          <w:p/>
+          <w:p>
+            <w:r>
+              <w:rPr>
+                <w:sz w:val="17"/>
+              </w:rPr>
+            </w:r>
+          </w:p>
         </w:tc>
         <w:tc>
           <w:tcPr>
-            <w:tcW w:type="dxa" w:w="2550"/>
+            <w:tcW w:type="dxa" w:w="2835"/>
           </w:tcPr>
-          <w:p/>
+          <w:p>
+            <w:r>
+              <w:rPr>
+                <w:sz w:val="17"/>
+              </w:rPr>
+            </w:r>
+          </w:p>
         </w:tc>
       </w:tr>
       <w:tr>
+        <w:trPr>
+          <w:trHeight w:val="351"/>
+        </w:trPr>
         <w:tc>
           <w:tcPr>
-            <w:tcW w:type="dxa" w:w="2550"/>
+            <w:tcW w:type="dxa" w:w="2438"/>
           </w:tcPr>
-          <w:p/>
+          <w:p>
+            <w:r>
+              <w:rPr>
+                <w:sz w:val="17"/>
+              </w:rPr>
+            </w:r>
+          </w:p>
         </w:tc>
         <w:tc>
           <w:tcPr>
-            <w:tcW w:type="dxa" w:w="2550"/>
+            <w:tcW w:type="dxa" w:w="2438"/>
           </w:tcPr>
-          <w:p/>
+          <w:p>
+            <w:r>
+              <w:rPr>
+                <w:sz w:val="17"/>
+              </w:rPr>
+            </w:r>
+          </w:p>
         </w:tc>
         <w:tc>
           <w:tcPr>
-            <w:tcW w:type="dxa" w:w="2550"/>
+            <w:tcW w:type="dxa" w:w="2154"/>
           </w:tcPr>
-          <w:p/>
+          <w:p>
+            <w:r>
+              <w:rPr>
+                <w:sz w:val="17"/>
+              </w:rPr>
+            </w:r>
+          </w:p>
         </w:tc>
         <w:tc>
           <w:tcPr>
-            <w:tcW w:type="dxa" w:w="2550"/>
+            <w:tcW w:type="dxa" w:w="2835"/>
           </w:tcPr>
-          <w:p/>
+          <w:p>
+            <w:r>
+              <w:rPr>
+                <w:sz w:val="17"/>
+              </w:rPr>
+            </w:r>
+          </w:p>
+        </w:tc>
+      </w:tr>
+      <w:tr>
+        <w:trPr>
+          <w:trHeight w:val="351"/>
+        </w:trPr>
+        <w:tc>
+          <w:tcPr>
+            <w:tcW w:type="dxa" w:w="2438"/>
+          </w:tcPr>
+          <w:p>
+            <w:r>
+              <w:rPr>
+                <w:sz w:val="17"/>
+              </w:rPr>
+            </w:r>
+          </w:p>
+        </w:tc>
+        <w:tc>
+          <w:tcPr>
+            <w:tcW w:type="dxa" w:w="2438"/>
+          </w:tcPr>
+          <w:p>
+            <w:r>
+              <w:rPr>
+                <w:sz w:val="17"/>
+              </w:rPr>
+            </w:r>
+          </w:p>
+        </w:tc>
+        <w:tc>
+          <w:tcPr>
+            <w:tcW w:type="dxa" w:w="2154"/>
+          </w:tcPr>
+          <w:p>
+            <w:r>
+              <w:rPr>
+                <w:sz w:val="17"/>
+              </w:rPr>
+            </w:r>
+          </w:p>
+        </w:tc>
+        <w:tc>
+          <w:tcPr>
+            <w:tcW w:type="dxa" w:w="2835"/>
+          </w:tcPr>
+          <w:p>
+            <w:r>
+              <w:rPr>
+                <w:sz w:val="17"/>
+              </w:rPr>
+            </w:r>
+          </w:p>
+        </w:tc>
+      </w:tr>
+      <w:tr>
+        <w:trPr>
+          <w:trHeight w:val="351"/>
+        </w:trPr>
+        <w:tc>
+          <w:tcPr>
+            <w:tcW w:type="dxa" w:w="2438"/>
+          </w:tcPr>
+          <w:p>
+            <w:r>
+              <w:rPr>
+                <w:sz w:val="17"/>
+              </w:rPr>
+            </w:r>
+          </w:p>
+        </w:tc>
+        <w:tc>
+          <w:tcPr>
+            <w:tcW w:type="dxa" w:w="2438"/>
+          </w:tcPr>
+          <w:p>
+            <w:r>
+              <w:rPr>
+                <w:sz w:val="17"/>
+              </w:rPr>
+            </w:r>
+          </w:p>
+        </w:tc>
+        <w:tc>
+          <w:tcPr>
+            <w:tcW w:type="dxa" w:w="2154"/>
+          </w:tcPr>
+          <w:p>
+            <w:r>
+              <w:rPr>
+                <w:sz w:val="17"/>
+              </w:rPr>
+            </w:r>
+          </w:p>
+        </w:tc>
+        <w:tc>
+          <w:tcPr>
+            <w:tcW w:type="dxa" w:w="2835"/>
+          </w:tcPr>
+          <w:p>
+            <w:r>
+              <w:rPr>
+                <w:sz w:val="17"/>
+              </w:rPr>
+            </w:r>
+          </w:p>
         </w:tc>
       </w:tr>
     </w:tbl>
     <w:p>
+      <w:pPr>
+        <w:spacing w:after="60" w:before="180"/>
+      </w:pPr>
       <w:r>
         <w:rPr>
           <w:b/>
+          <w:i w:val="0"/>
+          <w:color w:val="9A773A"/>
           <w:sz w:val="22"/>
         </w:rPr>
-        <w:t>3  Reference projects · Proyectos de referencia</w:t>
+        <w:t>3  Relevant projects</w:t>
       </w:r>
     </w:p>
     <w:p>
+      <w:pPr>
+        <w:spacing w:after="80" w:before="0"/>
+      </w:pPr>
       <w:r>
         <w:rPr>
-          <w:i/>
+          <w:b w:val="0"/>
+          <w:i w:val="0"/>
+          <w:color w:val="6B6860"/>
           <w:sz w:val="17"/>
         </w:rPr>
-        <w:t>Three to five; at least one masterplan or new district of 100 ha or more led or completed in the last fifteen years. De tres a cinco; al menos un plan maestro o nuevo distrito de 100 ha o más, liderado o terminado en los últimos quince años.</w:t>
+        <w:t>Projects that show you can carry a city plan from structure to streets. A portfolio can be attached as part of PDF ①.</w:t>
       </w:r>
     </w:p>
     <w:tbl>
@@ -401,17 +858,18 @@
         <w:tblLook w:firstColumn="1" w:firstRow="1" w:lastColumn="0" w:lastRow="0" w:noHBand="0" w:noVBand="1" w:val="04A0"/>
       </w:tblPr>
       <w:tblGrid>
-        <w:gridCol w:w="1700"/>
-        <w:gridCol w:w="1700"/>
-        <w:gridCol w:w="1700"/>
-        <w:gridCol w:w="1700"/>
-        <w:gridCol w:w="1700"/>
-        <w:gridCol w:w="1700"/>
+        <w:gridCol w:w="1644"/>
+        <w:gridCol w:w="1644"/>
+        <w:gridCol w:w="1644"/>
+        <w:gridCol w:w="1644"/>
+        <w:gridCol w:w="1644"/>
+        <w:gridCol w:w="1644"/>
       </w:tblGrid>
       <w:tr>
         <w:tc>
           <w:tcPr>
-            <w:tcW w:type="dxa" w:w="1700"/>
+            <w:tcW w:type="dxa" w:w="2041"/>
+            <w:shd w:val="clear" w:color="auto" w:fill="EFEBE3"/>
           </w:tcPr>
           <w:p>
             <w:r>
@@ -419,13 +877,14 @@
                 <w:b/>
                 <w:sz w:val="17"/>
               </w:rPr>
-              <w:t>Project · Proyecto</w:t>
+              <w:t>Project</w:t>
             </w:r>
           </w:p>
         </w:tc>
         <w:tc>
           <w:tcPr>
-            <w:tcW w:type="dxa" w:w="1700"/>
+            <w:tcW w:type="dxa" w:w="1474"/>
+            <w:shd w:val="clear" w:color="auto" w:fill="EFEBE3"/>
           </w:tcPr>
           <w:p>
             <w:r>
@@ -433,13 +892,14 @@
                 <w:b/>
                 <w:sz w:val="17"/>
               </w:rPr>
-              <w:t>Location · Lugar</w:t>
+              <w:t>Place</w:t>
             </w:r>
           </w:p>
         </w:tc>
         <w:tc>
           <w:tcPr>
-            <w:tcW w:type="dxa" w:w="1700"/>
+            <w:tcW w:type="dxa" w:w="1134"/>
+            <w:shd w:val="clear" w:color="auto" w:fill="EFEBE3"/>
           </w:tcPr>
           <w:p>
             <w:r>
@@ -447,13 +907,14 @@
                 <w:b/>
                 <w:sz w:val="17"/>
               </w:rPr>
-              <w:t>Scale (ha) · Escala</w:t>
+              <w:t>Size</w:t>
             </w:r>
           </w:p>
         </w:tc>
         <w:tc>
           <w:tcPr>
-            <w:tcW w:type="dxa" w:w="1700"/>
+            <w:tcW w:type="dxa" w:w="1247"/>
+            <w:shd w:val="clear" w:color="auto" w:fill="EFEBE3"/>
           </w:tcPr>
           <w:p>
             <w:r>
@@ -461,13 +922,14 @@
                 <w:b/>
                 <w:sz w:val="17"/>
               </w:rPr>
-              <w:t>Your role · Rol</w:t>
+              <w:t>Year, status</w:t>
             </w:r>
           </w:p>
         </w:tc>
         <w:tc>
           <w:tcPr>
-            <w:tcW w:type="dxa" w:w="1700"/>
+            <w:tcW w:type="dxa" w:w="1928"/>
+            <w:shd w:val="clear" w:color="auto" w:fill="EFEBE3"/>
           </w:tcPr>
           <w:p>
             <w:r>
@@ -475,13 +937,14 @@
                 <w:b/>
                 <w:sz w:val="17"/>
               </w:rPr>
-              <w:t>Status, year · Estado, año</w:t>
+              <w:t>What the practice did</w:t>
             </w:r>
           </w:p>
         </w:tc>
         <w:tc>
           <w:tcPr>
-            <w:tcW w:type="dxa" w:w="1700"/>
+            <w:tcW w:type="dxa" w:w="2041"/>
+            <w:shd w:val="clear" w:color="auto" w:fill="EFEBE3"/>
           </w:tcPr>
           <w:p>
             <w:r>
@@ -489,243 +952,423 @@
                 <w:b/>
                 <w:sz w:val="17"/>
               </w:rPr>
-              <w:t>Client · Cliente</w:t>
+              <w:t>What the lead designer did</w:t>
             </w:r>
           </w:p>
         </w:tc>
       </w:tr>
       <w:tr>
+        <w:trPr>
+          <w:trHeight w:val="510"/>
+        </w:trPr>
         <w:tc>
           <w:tcPr>
-            <w:tcW w:type="dxa" w:w="1700"/>
+            <w:tcW w:type="dxa" w:w="2041"/>
           </w:tcPr>
-          <w:p/>
+          <w:p>
+            <w:r>
+              <w:rPr>
+                <w:sz w:val="17"/>
+              </w:rPr>
+            </w:r>
+          </w:p>
         </w:tc>
         <w:tc>
           <w:tcPr>
-            <w:tcW w:type="dxa" w:w="1700"/>
+            <w:tcW w:type="dxa" w:w="1474"/>
           </w:tcPr>
-          <w:p/>
+          <w:p>
+            <w:r>
+              <w:rPr>
+                <w:sz w:val="17"/>
+              </w:rPr>
+            </w:r>
+          </w:p>
         </w:tc>
         <w:tc>
           <w:tcPr>
-            <w:tcW w:type="dxa" w:w="1700"/>
+            <w:tcW w:type="dxa" w:w="1134"/>
           </w:tcPr>
-          <w:p/>
+          <w:p>
+            <w:r>
+              <w:rPr>
+                <w:sz w:val="17"/>
+              </w:rPr>
+            </w:r>
+          </w:p>
         </w:tc>
         <w:tc>
           <w:tcPr>
-            <w:tcW w:type="dxa" w:w="1700"/>
+            <w:tcW w:type="dxa" w:w="1247"/>
           </w:tcPr>
-          <w:p/>
+          <w:p>
+            <w:r>
+              <w:rPr>
+                <w:sz w:val="17"/>
+              </w:rPr>
+            </w:r>
+          </w:p>
         </w:tc>
         <w:tc>
           <w:tcPr>
-            <w:tcW w:type="dxa" w:w="1700"/>
+            <w:tcW w:type="dxa" w:w="1928"/>
           </w:tcPr>
-          <w:p/>
+          <w:p>
+            <w:r>
+              <w:rPr>
+                <w:sz w:val="17"/>
+              </w:rPr>
+            </w:r>
+          </w:p>
         </w:tc>
         <w:tc>
           <w:tcPr>
-            <w:tcW w:type="dxa" w:w="1700"/>
+            <w:tcW w:type="dxa" w:w="2041"/>
           </w:tcPr>
-          <w:p/>
+          <w:p>
+            <w:r>
+              <w:rPr>
+                <w:sz w:val="17"/>
+              </w:rPr>
+            </w:r>
+          </w:p>
         </w:tc>
       </w:tr>
       <w:tr>
+        <w:trPr>
+          <w:trHeight w:val="510"/>
+        </w:trPr>
         <w:tc>
           <w:tcPr>
-            <w:tcW w:type="dxa" w:w="1700"/>
+            <w:tcW w:type="dxa" w:w="2041"/>
           </w:tcPr>
-          <w:p/>
+          <w:p>
+            <w:r>
+              <w:rPr>
+                <w:sz w:val="17"/>
+              </w:rPr>
+            </w:r>
+          </w:p>
         </w:tc>
         <w:tc>
           <w:tcPr>
-            <w:tcW w:type="dxa" w:w="1700"/>
+            <w:tcW w:type="dxa" w:w="1474"/>
           </w:tcPr>
-          <w:p/>
+          <w:p>
+            <w:r>
+              <w:rPr>
+                <w:sz w:val="17"/>
+              </w:rPr>
+            </w:r>
+          </w:p>
         </w:tc>
         <w:tc>
           <w:tcPr>
-            <w:tcW w:type="dxa" w:w="1700"/>
+            <w:tcW w:type="dxa" w:w="1134"/>
           </w:tcPr>
-          <w:p/>
+          <w:p>
+            <w:r>
+              <w:rPr>
+                <w:sz w:val="17"/>
+              </w:rPr>
+            </w:r>
+          </w:p>
         </w:tc>
         <w:tc>
           <w:tcPr>
-            <w:tcW w:type="dxa" w:w="1700"/>
+            <w:tcW w:type="dxa" w:w="1247"/>
           </w:tcPr>
-          <w:p/>
+          <w:p>
+            <w:r>
+              <w:rPr>
+                <w:sz w:val="17"/>
+              </w:rPr>
+            </w:r>
+          </w:p>
         </w:tc>
         <w:tc>
           <w:tcPr>
-            <w:tcW w:type="dxa" w:w="1700"/>
+            <w:tcW w:type="dxa" w:w="1928"/>
           </w:tcPr>
-          <w:p/>
+          <w:p>
+            <w:r>
+              <w:rPr>
+                <w:sz w:val="17"/>
+              </w:rPr>
+            </w:r>
+          </w:p>
         </w:tc>
         <w:tc>
           <w:tcPr>
-            <w:tcW w:type="dxa" w:w="1700"/>
+            <w:tcW w:type="dxa" w:w="2041"/>
           </w:tcPr>
-          <w:p/>
+          <w:p>
+            <w:r>
+              <w:rPr>
+                <w:sz w:val="17"/>
+              </w:rPr>
+            </w:r>
+          </w:p>
         </w:tc>
       </w:tr>
       <w:tr>
+        <w:trPr>
+          <w:trHeight w:val="510"/>
+        </w:trPr>
         <w:tc>
           <w:tcPr>
-            <w:tcW w:type="dxa" w:w="1700"/>
+            <w:tcW w:type="dxa" w:w="2041"/>
           </w:tcPr>
-          <w:p/>
+          <w:p>
+            <w:r>
+              <w:rPr>
+                <w:sz w:val="17"/>
+              </w:rPr>
+            </w:r>
+          </w:p>
         </w:tc>
         <w:tc>
           <w:tcPr>
-            <w:tcW w:type="dxa" w:w="1700"/>
+            <w:tcW w:type="dxa" w:w="1474"/>
           </w:tcPr>
-          <w:p/>
+          <w:p>
+            <w:r>
+              <w:rPr>
+                <w:sz w:val="17"/>
+              </w:rPr>
+            </w:r>
+          </w:p>
         </w:tc>
         <w:tc>
           <w:tcPr>
-            <w:tcW w:type="dxa" w:w="1700"/>
+            <w:tcW w:type="dxa" w:w="1134"/>
           </w:tcPr>
-          <w:p/>
+          <w:p>
+            <w:r>
+              <w:rPr>
+                <w:sz w:val="17"/>
+              </w:rPr>
+            </w:r>
+          </w:p>
         </w:tc>
         <w:tc>
           <w:tcPr>
-            <w:tcW w:type="dxa" w:w="1700"/>
+            <w:tcW w:type="dxa" w:w="1247"/>
           </w:tcPr>
-          <w:p/>
+          <w:p>
+            <w:r>
+              <w:rPr>
+                <w:sz w:val="17"/>
+              </w:rPr>
+            </w:r>
+          </w:p>
         </w:tc>
         <w:tc>
           <w:tcPr>
-            <w:tcW w:type="dxa" w:w="1700"/>
+            <w:tcW w:type="dxa" w:w="1928"/>
           </w:tcPr>
-          <w:p/>
+          <w:p>
+            <w:r>
+              <w:rPr>
+                <w:sz w:val="17"/>
+              </w:rPr>
+            </w:r>
+          </w:p>
         </w:tc>
         <w:tc>
           <w:tcPr>
-            <w:tcW w:type="dxa" w:w="1700"/>
+            <w:tcW w:type="dxa" w:w="2041"/>
           </w:tcPr>
-          <w:p/>
+          <w:p>
+            <w:r>
+              <w:rPr>
+                <w:sz w:val="17"/>
+              </w:rPr>
+            </w:r>
+          </w:p>
         </w:tc>
       </w:tr>
       <w:tr>
+        <w:trPr>
+          <w:trHeight w:val="510"/>
+        </w:trPr>
         <w:tc>
           <w:tcPr>
-            <w:tcW w:type="dxa" w:w="1700"/>
+            <w:tcW w:type="dxa" w:w="2041"/>
           </w:tcPr>
-          <w:p/>
+          <w:p>
+            <w:r>
+              <w:rPr>
+                <w:sz w:val="17"/>
+              </w:rPr>
+            </w:r>
+          </w:p>
         </w:tc>
         <w:tc>
           <w:tcPr>
-            <w:tcW w:type="dxa" w:w="1700"/>
+            <w:tcW w:type="dxa" w:w="1474"/>
           </w:tcPr>
-          <w:p/>
+          <w:p>
+            <w:r>
+              <w:rPr>
+                <w:sz w:val="17"/>
+              </w:rPr>
+            </w:r>
+          </w:p>
         </w:tc>
         <w:tc>
           <w:tcPr>
-            <w:tcW w:type="dxa" w:w="1700"/>
+            <w:tcW w:type="dxa" w:w="1134"/>
           </w:tcPr>
-          <w:p/>
+          <w:p>
+            <w:r>
+              <w:rPr>
+                <w:sz w:val="17"/>
+              </w:rPr>
+            </w:r>
+          </w:p>
         </w:tc>
         <w:tc>
           <w:tcPr>
-            <w:tcW w:type="dxa" w:w="1700"/>
+            <w:tcW w:type="dxa" w:w="1247"/>
           </w:tcPr>
-          <w:p/>
+          <w:p>
+            <w:r>
+              <w:rPr>
+                <w:sz w:val="17"/>
+              </w:rPr>
+            </w:r>
+          </w:p>
         </w:tc>
         <w:tc>
           <w:tcPr>
-            <w:tcW w:type="dxa" w:w="1700"/>
+            <w:tcW w:type="dxa" w:w="1928"/>
           </w:tcPr>
-          <w:p/>
+          <w:p>
+            <w:r>
+              <w:rPr>
+                <w:sz w:val="17"/>
+              </w:rPr>
+            </w:r>
+          </w:p>
         </w:tc>
         <w:tc>
           <w:tcPr>
-            <w:tcW w:type="dxa" w:w="1700"/>
+            <w:tcW w:type="dxa" w:w="2041"/>
           </w:tcPr>
-          <w:p/>
+          <w:p>
+            <w:r>
+              <w:rPr>
+                <w:sz w:val="17"/>
+              </w:rPr>
+            </w:r>
+          </w:p>
         </w:tc>
       </w:tr>
       <w:tr>
+        <w:trPr>
+          <w:trHeight w:val="510"/>
+        </w:trPr>
         <w:tc>
           <w:tcPr>
-            <w:tcW w:type="dxa" w:w="1700"/>
+            <w:tcW w:type="dxa" w:w="2041"/>
           </w:tcPr>
-          <w:p/>
+          <w:p>
+            <w:r>
+              <w:rPr>
+                <w:sz w:val="17"/>
+              </w:rPr>
+            </w:r>
+          </w:p>
         </w:tc>
         <w:tc>
           <w:tcPr>
-            <w:tcW w:type="dxa" w:w="1700"/>
+            <w:tcW w:type="dxa" w:w="1474"/>
           </w:tcPr>
-          <w:p/>
+          <w:p>
+            <w:r>
+              <w:rPr>
+                <w:sz w:val="17"/>
+              </w:rPr>
+            </w:r>
+          </w:p>
         </w:tc>
         <w:tc>
           <w:tcPr>
-            <w:tcW w:type="dxa" w:w="1700"/>
+            <w:tcW w:type="dxa" w:w="1134"/>
           </w:tcPr>
-          <w:p/>
+          <w:p>
+            <w:r>
+              <w:rPr>
+                <w:sz w:val="17"/>
+              </w:rPr>
+            </w:r>
+          </w:p>
         </w:tc>
         <w:tc>
           <w:tcPr>
-            <w:tcW w:type="dxa" w:w="1700"/>
+            <w:tcW w:type="dxa" w:w="1247"/>
           </w:tcPr>
-          <w:p/>
+          <w:p>
+            <w:r>
+              <w:rPr>
+                <w:sz w:val="17"/>
+              </w:rPr>
+            </w:r>
+          </w:p>
         </w:tc>
         <w:tc>
           <w:tcPr>
-            <w:tcW w:type="dxa" w:w="1700"/>
+            <w:tcW w:type="dxa" w:w="1928"/>
           </w:tcPr>
-          <w:p/>
+          <w:p>
+            <w:r>
+              <w:rPr>
+                <w:sz w:val="17"/>
+              </w:rPr>
+            </w:r>
+          </w:p>
         </w:tc>
         <w:tc>
           <w:tcPr>
-            <w:tcW w:type="dxa" w:w="1700"/>
+            <w:tcW w:type="dxa" w:w="2041"/>
           </w:tcPr>
-          <w:p/>
+          <w:p>
+            <w:r>
+              <w:rPr>
+                <w:sz w:val="17"/>
+              </w:rPr>
+            </w:r>
+          </w:p>
         </w:tc>
       </w:tr>
     </w:tbl>
     <w:p>
+      <w:pPr>
+        <w:spacing w:after="60" w:before="180"/>
+      </w:pPr>
       <w:r>
         <w:rPr>
           <w:b/>
+          <w:i w:val="0"/>
+          <w:color w:val="9A773A"/>
           <w:sz w:val="22"/>
         </w:rPr>
-        <w:t>4  Declarations · Declaraciones</w:t>
+        <w:t>4  Consortium (if any)</w:t>
       </w:r>
     </w:p>
     <w:p>
-      <w:r>
-        <w:t>☐ The lead is a legally constituted practice in urban design, planning, landscape architecture or architecture. · El líder es un estudio legalmente constituido de diseño urbano, planificación, paisaje o arquitectura.</w:t>
-      </w:r>
-    </w:p>
-    <w:p>
-      <w:r>
-        <w:t>☐ No firm in this team leads or joins another team. · Ningún estudio de este equipo lidera ni integra otro equipo.</w:t>
-      </w:r>
-    </w:p>
-    <w:p>
-      <w:r>
-        <w:t>☐ No member has a conflict of interest with the organiser or the jury (signed declaration attached). · Ningún integrante tiene conflicto de intereses con el organizador o el jurado (declaración firmada adjunta).</w:t>
-      </w:r>
-    </w:p>
-    <w:p>
-      <w:r>
-        <w:t>☐ AI tools we use, if any, are disclosed in the approach statement. · Las herramientas de IA que usemos, si las hay, se declaran en la declaración de enfoque.</w:t>
-      </w:r>
-    </w:p>
-    <w:p>
-      <w:r>
-        <w:t>☐ We accept that dates, the jury, the honorarium and the terms that follow are published with the formal rules, which then govern. · Aceptamos que las fechas, el jurado, el honorario y las condiciones posteriores se publican con las bases oficiales, que entonces rigen.</w:t>
-      </w:r>
-    </w:p>
-    <w:p>
+      <w:pPr>
+        <w:spacing w:after="80" w:before="0"/>
+      </w:pPr>
       <w:r>
         <w:rPr>
-          <w:b/>
-          <w:sz w:val="22"/>
+          <w:b w:val="0"/>
+          <w:i w:val="0"/>
+          <w:color w:val="6B6860"/>
+          <w:sz w:val="17"/>
         </w:rPr>
-        <w:t>5  Signature · Firma</w:t>
+        <w:t>Attach the agreement signed by every member, naming the lead and the roles.</w:t>
       </w:r>
     </w:p>
     <w:tbl>
@@ -735,74 +1378,455 @@
         <w:tblLook w:firstColumn="1" w:firstRow="1" w:lastColumn="0" w:lastRow="0" w:noHBand="0" w:noVBand="1" w:val="04A0"/>
       </w:tblPr>
       <w:tblGrid>
-        <w:gridCol w:w="5100"/>
-        <w:gridCol w:w="5100"/>
+        <w:gridCol w:w="3289"/>
+        <w:gridCol w:w="3289"/>
+        <w:gridCol w:w="3289"/>
       </w:tblGrid>
       <w:tr>
         <w:tc>
           <w:tcPr>
-            <w:tcW w:type="dxa" w:w="5100"/>
+            <w:tcW w:type="dxa" w:w="3175"/>
+            <w:shd w:val="clear" w:color="auto" w:fill="EFEBE3"/>
           </w:tcPr>
           <w:p>
             <w:r>
-              <w:t>Name and role of signatory · Nombre y cargo</w:t>
+              <w:rPr>
+                <w:b/>
+                <w:sz w:val="17"/>
+              </w:rPr>
+              <w:t>Member</w:t>
             </w:r>
           </w:p>
         </w:tc>
         <w:tc>
           <w:tcPr>
-            <w:tcW w:type="dxa" w:w="5100"/>
-          </w:tcPr>
-          <w:p/>
-        </w:tc>
-      </w:tr>
-      <w:tr>
-        <w:tc>
-          <w:tcPr>
-            <w:tcW w:type="dxa" w:w="5100"/>
+            <w:tcW w:type="dxa" w:w="3175"/>
+            <w:shd w:val="clear" w:color="auto" w:fill="EFEBE3"/>
           </w:tcPr>
           <w:p>
             <w:r>
-              <w:t>Signature · Firma</w:t>
+              <w:rPr>
+                <w:b/>
+                <w:sz w:val="17"/>
+              </w:rPr>
+              <w:t>Country</w:t>
             </w:r>
           </w:p>
         </w:tc>
         <w:tc>
           <w:tcPr>
-            <w:tcW w:type="dxa" w:w="5100"/>
+            <w:tcW w:type="dxa" w:w="3515"/>
+            <w:shd w:val="clear" w:color="auto" w:fill="EFEBE3"/>
           </w:tcPr>
-          <w:p/>
+          <w:p>
+            <w:r>
+              <w:rPr>
+                <w:b/>
+                <w:sz w:val="17"/>
+              </w:rPr>
+              <w:t>Role in the consortium</w:t>
+            </w:r>
+          </w:p>
         </w:tc>
       </w:tr>
       <w:tr>
+        <w:trPr>
+          <w:trHeight w:val="351"/>
+        </w:trPr>
         <w:tc>
           <w:tcPr>
-            <w:tcW w:type="dxa" w:w="5100"/>
+            <w:tcW w:type="dxa" w:w="3175"/>
           </w:tcPr>
           <w:p>
             <w:r>
-              <w:t>Date · Fecha</w:t>
+              <w:rPr>
+                <w:sz w:val="17"/>
+              </w:rPr>
             </w:r>
           </w:p>
         </w:tc>
         <w:tc>
           <w:tcPr>
-            <w:tcW w:type="dxa" w:w="5100"/>
+            <w:tcW w:type="dxa" w:w="3175"/>
           </w:tcPr>
-          <w:p/>
+          <w:p>
+            <w:r>
+              <w:rPr>
+                <w:sz w:val="17"/>
+              </w:rPr>
+            </w:r>
+          </w:p>
+        </w:tc>
+        <w:tc>
+          <w:tcPr>
+            <w:tcW w:type="dxa" w:w="3515"/>
+          </w:tcPr>
+          <w:p>
+            <w:r>
+              <w:rPr>
+                <w:sz w:val="17"/>
+              </w:rPr>
+            </w:r>
+          </w:p>
+        </w:tc>
+      </w:tr>
+      <w:tr>
+        <w:trPr>
+          <w:trHeight w:val="351"/>
+        </w:trPr>
+        <w:tc>
+          <w:tcPr>
+            <w:tcW w:type="dxa" w:w="3175"/>
+          </w:tcPr>
+          <w:p>
+            <w:r>
+              <w:rPr>
+                <w:sz w:val="17"/>
+              </w:rPr>
+            </w:r>
+          </w:p>
+        </w:tc>
+        <w:tc>
+          <w:tcPr>
+            <w:tcW w:type="dxa" w:w="3175"/>
+          </w:tcPr>
+          <w:p>
+            <w:r>
+              <w:rPr>
+                <w:sz w:val="17"/>
+              </w:rPr>
+            </w:r>
+          </w:p>
+        </w:tc>
+        <w:tc>
+          <w:tcPr>
+            <w:tcW w:type="dxa" w:w="3515"/>
+          </w:tcPr>
+          <w:p>
+            <w:r>
+              <w:rPr>
+                <w:sz w:val="17"/>
+              </w:rPr>
+            </w:r>
+          </w:p>
+        </w:tc>
+      </w:tr>
+      <w:tr>
+        <w:trPr>
+          <w:trHeight w:val="351"/>
+        </w:trPr>
+        <w:tc>
+          <w:tcPr>
+            <w:tcW w:type="dxa" w:w="3175"/>
+          </w:tcPr>
+          <w:p>
+            <w:r>
+              <w:rPr>
+                <w:sz w:val="17"/>
+              </w:rPr>
+            </w:r>
+          </w:p>
+        </w:tc>
+        <w:tc>
+          <w:tcPr>
+            <w:tcW w:type="dxa" w:w="3175"/>
+          </w:tcPr>
+          <w:p>
+            <w:r>
+              <w:rPr>
+                <w:sz w:val="17"/>
+              </w:rPr>
+            </w:r>
+          </w:p>
+        </w:tc>
+        <w:tc>
+          <w:tcPr>
+            <w:tcW w:type="dxa" w:w="3515"/>
+          </w:tcPr>
+          <w:p>
+            <w:r>
+              <w:rPr>
+                <w:sz w:val="17"/>
+              </w:rPr>
+            </w:r>
+          </w:p>
         </w:tc>
       </w:tr>
     </w:tbl>
     <w:p>
+      <w:pPr>
+        <w:spacing w:after="60" w:before="180"/>
+      </w:pPr>
       <w:r>
         <w:rPr>
-          <w:sz w:val="17"/>
+          <w:b/>
+          <w:i w:val="0"/>
+          <w:color w:val="9A773A"/>
+          <w:sz w:val="22"/>
         </w:rPr>
-        <w:t>Send with the application PDF to competition@xcity.ai · Envíe con el PDF a competition@xcity.ai</w:t>
+        <w:t>5  Attached to PDF ①</w:t>
       </w:r>
     </w:p>
+    <w:p>
+      <w:pPr>
+        <w:spacing w:after="20" w:before="0"/>
+      </w:pPr>
+      <w:r>
+        <w:rPr>
+          <w:b w:val="0"/>
+          <w:i w:val="0"/>
+          <w:color w:val="1F1F1F"/>
+          <w:sz w:val="18"/>
+        </w:rPr>
+        <w:t>☐  Proof of legal registration of each member</w:t>
+      </w:r>
+    </w:p>
+    <w:p>
+      <w:pPr>
+        <w:spacing w:after="20" w:before="0"/>
+      </w:pPr>
+      <w:r>
+        <w:rPr>
+          <w:b w:val="0"/>
+          <w:i w:val="0"/>
+          <w:color w:val="1F1F1F"/>
+          <w:sz w:val="18"/>
+        </w:rPr>
+        <w:t>☐  The professional licence or permit that applies where you practise; where practices are not graded, equivalent evidence and a short explanation</w:t>
+      </w:r>
+    </w:p>
+    <w:p>
+      <w:pPr>
+        <w:spacing w:after="20" w:before="0"/>
+      </w:pPr>
+      <w:r>
+        <w:rPr>
+          <w:b w:val="0"/>
+          <w:i w:val="0"/>
+          <w:color w:val="1F1F1F"/>
+          <w:sz w:val="18"/>
+        </w:rPr>
+        <w:t>☐  Consortium agreement, if any</w:t>
+      </w:r>
+    </w:p>
+    <w:p>
+      <w:pPr>
+        <w:spacing w:after="20" w:before="0"/>
+      </w:pPr>
+      <w:r>
+        <w:rPr>
+          <w:b w:val="0"/>
+          <w:i w:val="0"/>
+          <w:color w:val="1F1F1F"/>
+          <w:sz w:val="18"/>
+        </w:rPr>
+        <w:t>☐  Portfolio or project sheets (optional)</w:t>
+      </w:r>
+    </w:p>
+    <w:p>
+      <w:pPr>
+        <w:spacing w:after="60" w:before="180"/>
+      </w:pPr>
+      <w:r>
+        <w:rPr>
+          <w:b/>
+          <w:i w:val="0"/>
+          <w:color w:val="9A773A"/>
+          <w:sz w:val="22"/>
+        </w:rPr>
+        <w:t>6  Declarations</w:t>
+      </w:r>
+    </w:p>
+    <w:p>
+      <w:pPr>
+        <w:spacing w:after="20" w:before="0"/>
+      </w:pPr>
+      <w:r>
+        <w:rPr>
+          <w:b w:val="0"/>
+          <w:i w:val="0"/>
+          <w:color w:val="1F1F1F"/>
+          <w:sz w:val="18"/>
+        </w:rPr>
+        <w:t>☐  The information in this application is true and can be verified.</w:t>
+      </w:r>
+    </w:p>
+    <w:p>
+      <w:pPr>
+        <w:spacing w:after="20" w:before="0"/>
+      </w:pPr>
+      <w:r>
+        <w:rPr>
+          <w:b w:val="0"/>
+          <w:i w:val="0"/>
+          <w:color w:val="1F1F1F"/>
+          <w:sz w:val="18"/>
+        </w:rPr>
+        <w:t>☐  No firm or person in this team leads or joins another team.</w:t>
+      </w:r>
+    </w:p>
+    <w:p>
+      <w:pPr>
+        <w:spacing w:after="20" w:before="0"/>
+      </w:pPr>
+      <w:r>
+        <w:rPr>
+          <w:b w:val="0"/>
+          <w:i w:val="0"/>
+          <w:color w:val="1F1F1F"/>
+          <w:sz w:val="18"/>
+        </w:rPr>
+        <w:t>☐  Any relation to the organiser or to members of the jury is disclosed here: ______________________________ (or none).</w:t>
+      </w:r>
+    </w:p>
+    <w:p>
+      <w:pPr>
+        <w:spacing w:after="20" w:before="0"/>
+      </w:pPr>
+      <w:r>
+        <w:rPr>
+          <w:b w:val="0"/>
+          <w:i w:val="0"/>
+          <w:color w:val="1F1F1F"/>
+          <w:sz w:val="18"/>
+        </w:rPr>
+        <w:t>☐  AI tools we use, if any, are disclosed in the initial ideas.</w:t>
+      </w:r>
+    </w:p>
+    <w:p>
+      <w:pPr>
+        <w:spacing w:after="20" w:before="0"/>
+      </w:pPr>
+      <w:r>
+        <w:rPr>
+          <w:b w:val="0"/>
+          <w:i w:val="0"/>
+          <w:color w:val="1F1F1F"/>
+          <w:sz w:val="18"/>
+        </w:rPr>
+        <w:t>☐  We accept that the formal rules, once published, govern the call.</w:t>
+      </w:r>
+    </w:p>
+    <w:p>
+      <w:pPr>
+        <w:spacing w:after="60" w:before="180"/>
+      </w:pPr>
+      <w:r>
+        <w:rPr>
+          <w:b/>
+          <w:i w:val="0"/>
+          <w:color w:val="9A773A"/>
+          <w:sz w:val="22"/>
+        </w:rPr>
+        <w:t>7  Signature</w:t>
+      </w:r>
+    </w:p>
+    <w:tbl>
+      <w:tblPr>
+        <w:tblStyle w:val="TableGrid"/>
+        <w:tblW w:type="auto" w:w="0"/>
+        <w:tblLook w:firstColumn="1" w:firstRow="1" w:lastColumn="0" w:lastRow="0" w:noHBand="0" w:noVBand="1" w:val="04A0"/>
+      </w:tblPr>
+      <w:tblGrid>
+        <w:gridCol w:w="4933"/>
+        <w:gridCol w:w="4933"/>
+      </w:tblGrid>
+      <w:tr>
+        <w:trPr>
+          <w:trHeight w:val="454"/>
+        </w:trPr>
+        <w:tc>
+          <w:tcPr>
+            <w:tcW w:type="dxa" w:w="3515"/>
+          </w:tcPr>
+          <w:p>
+            <w:r>
+              <w:rPr>
+                <w:color w:val="6B6860"/>
+                <w:sz w:val="17"/>
+              </w:rPr>
+              <w:t>Name and role of signatory</w:t>
+            </w:r>
+          </w:p>
+        </w:tc>
+        <w:tc>
+          <w:tcPr>
+            <w:tcW w:type="dxa" w:w="6350"/>
+          </w:tcPr>
+          <w:p>
+            <w:r>
+              <w:rPr>
+                <w:sz w:val="17"/>
+              </w:rPr>
+            </w:r>
+          </w:p>
+        </w:tc>
+      </w:tr>
+      <w:tr>
+        <w:trPr>
+          <w:trHeight w:val="454"/>
+        </w:trPr>
+        <w:tc>
+          <w:tcPr>
+            <w:tcW w:type="dxa" w:w="3515"/>
+          </w:tcPr>
+          <w:p>
+            <w:r>
+              <w:rPr>
+                <w:color w:val="6B6860"/>
+                <w:sz w:val="17"/>
+              </w:rPr>
+              <w:t>Signature</w:t>
+            </w:r>
+          </w:p>
+        </w:tc>
+        <w:tc>
+          <w:tcPr>
+            <w:tcW w:type="dxa" w:w="6350"/>
+          </w:tcPr>
+          <w:p>
+            <w:r>
+              <w:rPr>
+                <w:sz w:val="17"/>
+              </w:rPr>
+            </w:r>
+          </w:p>
+        </w:tc>
+      </w:tr>
+      <w:tr>
+        <w:trPr>
+          <w:trHeight w:val="454"/>
+        </w:trPr>
+        <w:tc>
+          <w:tcPr>
+            <w:tcW w:type="dxa" w:w="3515"/>
+          </w:tcPr>
+          <w:p>
+            <w:r>
+              <w:rPr>
+                <w:color w:val="6B6860"/>
+                <w:sz w:val="17"/>
+              </w:rPr>
+              <w:t>Date</w:t>
+            </w:r>
+          </w:p>
+        </w:tc>
+        <w:tc>
+          <w:tcPr>
+            <w:tcW w:type="dxa" w:w="6350"/>
+          </w:tcPr>
+          <w:p>
+            <w:r>
+              <w:rPr>
+                <w:sz w:val="17"/>
+              </w:rPr>
+            </w:r>
+          </w:p>
+        </w:tc>
+      </w:tr>
+    </w:tbl>
     <w:sectPr>
-      <w:pgSz w:w="12240" w:h="15840"/>
+      <w:pgSz w:w="11906" w:h="16838"/>
       <w:pgMar w:top="907" w:right="1020" w:bottom="907" w:left="1020" w:header="720" w:footer="720" w:gutter="0"/>
       <w:cols w:space="720"/>
       <w:docGrid w:linePitch="360"/>
@@ -1174,8 +2198,12 @@
     <w:name w:val="Normal"/>
     <w:qFormat/>
     <w:rsid w:val="00FC693F"/>
+    <w:pPr>
+      <w:spacing w:after="40"/>
+    </w:pPr>
     <w:rPr>
-      <w:rFonts w:ascii="Arial" w:hAnsi="Arial"/>
+      <w:rFonts w:ascii="Arial" w:hAnsi="Arial" w:eastAsia="Arial"/>
+      <w:color w:val="1F1F1F"/>
       <w:sz w:val="19"/>
     </w:rPr>
   </w:style>

</xml_diff>